<commit_message>
docs(lab3): finalize report with PR link and visual verification
</commit_message>
<xml_diff>
--- a/reports/lab3/Отчёт_ЛР3_Баланс.docx
+++ b/reports/lab3/Отчёт_ЛР3_Баланс.docx
@@ -493,7 +493,7 @@
           <w:color w:val="000000"/>
           <w:sz w:val="28"/>
         </w:rPr>
-        <w:t>3.3 Бизнес цели и границы проекта</w:t>
+        <w:t>3.3 Цели и границы проекта</w:t>
         <w:tab/>
         <w:t>6</w:t>
       </w:r>
@@ -1911,7 +1911,7 @@
           <w:color w:val="000000"/>
           <w:sz w:val="28"/>
         </w:rPr>
-        <w:t>3.3 Бизнес цели и границы проекта</w:t>
+        <w:t>3.3 Цели и границы проекта</w:t>
       </w:r>
     </w:p>
     <w:p>
@@ -5846,7 +5846,7 @@
           <w:color w:val="000000"/>
           <w:sz w:val="24"/>
         </w:rPr>
-        <w:t>Pull request: https://github.com/ekuzm/SDLC/pulls</w:t>
+        <w:t>Pull request: https://github.com/ekuzm/SDLC/pull/1</w:t>
       </w:r>
     </w:p>
     <w:p>
@@ -7077,7 +7077,7 @@
           <w:color w:val="000000"/>
           <w:sz w:val="28"/>
         </w:rPr>
-        <w:t>Прежде всего ограничены бюджет, время и доступность участников. Заказчик также учитывает стоимость сопровождения, сложность внедрения и время, которое потребуется на уточнение требований. Для «Баланса» существенны учебный срок и повседневные затраты времени пользователя: ввод операции должен быть коротким, а местная демонстрация не должна требовать платных сервисов.</w:t>
+        <w:t>Прежде всего ограничены бюджет, время и доступность участников. Заказчик также учитывает стоимость сопровождения, сложность внедрения и время, которое потребуется на уточнение требований. Для «Баланса» существенны учебный срок и повседневные затраты времени пользователя: ввод операции должен быть коротким, а локальная демонстрация не должна требовать платных сервисов.</w:t>
       </w:r>
     </w:p>
     <w:p>
@@ -8259,7 +8259,7 @@
           <w:color w:val="000000"/>
           <w:sz w:val="24"/>
         </w:rPr>
-        <w:t>https://github.com/ekuzm/SDLC/pulls</w:t>
+        <w:t>https://github.com/ekuzm/SDLC/pull/1</w:t>
       </w:r>
     </w:p>
     <w:p>

</xml_diff>

<commit_message>
docs(lab3): rebuild Balance SRS and graphics with SysML Pilot
</commit_message>
<xml_diff>
--- a/reports/lab3/Отчёт_ЛР3_Баланс.docx
+++ b/reports/lab3/Отчёт_ЛР3_Баланс.docx
@@ -471,7 +471,7 @@
           <w:color w:val="000000"/>
           <w:sz w:val="28"/>
         </w:rPr>
-        <w:t>3.2 Ролевая модель и выявление требований</w:t>
+        <w:t>3.2 Пользователь и исходные потребности</w:t>
         <w:tab/>
         <w:t>5</w:t>
       </w:r>
@@ -539,7 +539,7 @@
         </w:rPr>
         <w:t>3.5 Прототипы пользовательского интерфейса</w:t>
         <w:tab/>
-        <w:t>12</w:t>
+        <w:t>10</w:t>
       </w:r>
     </w:p>
     <w:p>
@@ -603,7 +603,7 @@
           <w:color w:val="000000"/>
           <w:sz w:val="28"/>
         </w:rPr>
-        <w:t>3.8 Рецензирование и внесение изменений</w:t>
+        <w:t>3.8 Проверка и уточнение требований</w:t>
         <w:tab/>
         <w:t>18</w:t>
       </w:r>
@@ -790,7 +790,7 @@
           <w:color w:val="000000"/>
           <w:sz w:val="28"/>
         </w:rPr>
-        <w:t>В работе определены пользователи, границы и бизнес-цели продукта, подготовлены требования и графические материалы. Их согласование проводится в учебной паре «заказчик — менеджер проекта» в соответствии с методическими указаниями [1].</w:t>
+        <w:t>В работе определены пользователи, границы и бизнес-цели продукта, подготовлены требования и графические материалы. Состав материалов соответствует заданию по разработке бизнес-требований [1].</w:t>
       </w:r>
     </w:p>
     <w:p>
@@ -841,7 +841,7 @@
           <w:color w:val="000000"/>
           <w:sz w:val="28"/>
         </w:rPr>
-        <w:t>2 Подготовить интервью для выявления потребностей и согласовать его с назначенным напарником.</w:t>
+        <w:t>2 Определить проблемы пользователя, бизнес-цели и границы первой версии.</w:t>
       </w:r>
     </w:p>
     <w:p>
@@ -909,7 +909,7 @@
           <w:color w:val="000000"/>
           <w:sz w:val="28"/>
         </w:rPr>
-        <w:t>6 Провести предварительное рецензирование, оформить решения и обновить требования.</w:t>
+        <w:t>6 Проверить однозначность требований и согласованность связанных материалов.</w:t>
       </w:r>
     </w:p>
     <w:p>
@@ -926,7 +926,7 @@
           <w:color w:val="000000"/>
           <w:sz w:val="28"/>
         </w:rPr>
-        <w:t>7 Зафиксировать материалы в отдельной ветке и открыть pull request для реального рецензирования.</w:t>
+        <w:t>7 Зафиксировать материалы в отдельной ветке и открыть pull request для рассмотрения требований.</w:t>
       </w:r>
     </w:p>
     <w:p>
@@ -1858,7 +1858,7 @@
           <w:color w:val="000000"/>
           <w:sz w:val="28"/>
         </w:rPr>
-        <w:t>3.2 Ролевая модель и выявление требований</w:t>
+        <w:t>3.2 Пользователь и исходные потребности</w:t>
       </w:r>
     </w:p>
     <w:p>
@@ -1875,7 +1875,7 @@
           <w:color w:val="000000"/>
           <w:sz w:val="28"/>
         </w:rPr>
-        <w:t>Менеджер проекта — Кузьменков Е. В. Напарник-заказчик — Новицкий Е. Ю. Предварительные вопросы и модельные ответы подготовлены с ассистентом в роли заказчика. Ответы и замечания Новицкого Е. Ю. на момент подготовки материалов ещё не получены; протокол предназначен для его подтверждения.</w:t>
+        <w:t>Основной пользователь — студент или молодой специалист, который ведёт личный бюджет. Ему требуется быстро записывать расходы, видеть доступную сумму и учитывать будущие обязательства.</w:t>
       </w:r>
     </w:p>
     <w:p>
@@ -1892,7 +1892,7 @@
           <w:color w:val="000000"/>
           <w:sz w:val="28"/>
         </w:rPr>
-        <w:t>Исходный замысел согласован с автором проекта: единый бюджет в BYN, ручные операции, оба прогноза и прозрачные формулы. В интервью уточнены необходимость исправления записей, контроль лимитов без запрета расходов и ручное подтверждение плановых платежей.</w:t>
+        <w:t>В требованиях закреплены единый бюджет в BYN, ручной ввод и прозрачные формулы. Пользователь может исправлять записи; превышение лимита показывается предупреждением; плановый платёж становится фактом только после подтверждения.</w:t>
       </w:r>
     </w:p>
     <w:p>
@@ -2414,7 +2414,7 @@
           <w:color w:val="000000"/>
           <w:sz w:val="28"/>
         </w:rPr>
-        <w:t>Исходная модель хранится в srs/sysml/balance.sysml. Она включает 37 требований, шесть вариантов использования, 37 связей satisfy, состояния экранов и логические данные. Единственный активный пользователь — владелец бюджета.</w:t>
+        <w:t>Исходники находятся в srs/sysml. Модель balance.sysml содержит 37 требований и 37 связей satisfy. Контекст, варианты использования и шесть экранов описаны отдельными файлами. Все модели загружаются в SysML v2 Pilot Implementation 0.62.0 одной единицей для разрешения взаимных ссылок.</w:t>
       </w:r>
     </w:p>
     <w:p>
@@ -2435,8 +2435,110 @@
       <w:r>
         <w:drawing>
           <wp:inline xmlns:a="http://schemas.openxmlformats.org/drawingml/2006/main" xmlns:pic="http://schemas.openxmlformats.org/drawingml/2006/picture">
-            <wp:extent cx="5760000" cy="3805714"/>
+            <wp:extent cx="5940000" cy="4984768"/>
             <wp:docPr id="1" name="Picture 1"/>
+            <wp:cNvGraphicFramePr>
+              <a:graphicFrameLocks noChangeAspect="1"/>
+            </wp:cNvGraphicFramePr>
+            <a:graphic>
+              <a:graphicData uri="http://schemas.openxmlformats.org/drawingml/2006/picture">
+                <pic:pic>
+                  <pic:nvPicPr>
+                    <pic:cNvPr id="0" name="context.png"/>
+                    <pic:cNvPicPr/>
+                  </pic:nvPicPr>
+                  <pic:blipFill>
+                    <a:blip r:embed="rId20"/>
+                    <a:stretch>
+                      <a:fillRect/>
+                    </a:stretch>
+                  </pic:blipFill>
+                  <pic:spPr>
+                    <a:xfrm>
+                      <a:off x="0" y="0"/>
+                      <a:ext cx="5940000" cy="4984768"/>
+                    </a:xfrm>
+                    <a:prstGeom prst="rect"/>
+                  </pic:spPr>
+                </pic:pic>
+              </a:graphicData>
+            </a:graphic>
+          </wp:inline>
+        </w:drawing>
+      </w:r>
+    </w:p>
+    <w:p>
+      <w:pPr>
+        <w:keepNext w:val="0"/>
+        <w:spacing w:after="240" w:before="0" w:line="360" w:lineRule="exact"/>
+        <w:ind w:firstLine="0" w:left="0" w:right="0"/>
+        <w:jc w:val="center"/>
+      </w:pPr>
+      <w:r>
+        <w:rPr>
+          <w:rFonts w:ascii="Times New Roman" w:hAnsi="Times New Roman"/>
+          <w:b w:val="0"/>
+          <w:color w:val="000000"/>
+          <w:sz w:val="28"/>
+        </w:rPr>
+        <w:t>Рисунок 3.1 — Контекст системы Баланс</w:t>
+      </w:r>
+    </w:p>
+    <w:p>
+      <w:pPr>
+        <w:keepNext w:val="0"/>
+        <w:spacing w:after="0" w:before="0" w:line="360" w:lineRule="exact"/>
+        <w:ind w:firstLine="709" w:left="0" w:right="0"/>
+        <w:jc w:val="both"/>
+      </w:pPr>
+      <w:r>
+        <w:rPr>
+          <w:rFonts w:ascii="Times New Roman" w:hAnsi="Times New Roman"/>
+          <w:b w:val="0"/>
+          <w:color w:val="000000"/>
+          <w:sz w:val="28"/>
+        </w:rPr>
+        <w:t>Пользователь взаимодействует с браузерным интерфейсом. Сервер Go обрабатывает запросы и выполняет расчёты; хранилище сохраняет данные. Конкретная СУБД не выбирается на стадии требований. Внешние финансовые API не требуются.</w:t>
+      </w:r>
+    </w:p>
+    <w:p>
+      <w:pPr>
+        <w:keepNext w:val="0"/>
+        <w:pageBreakBefore/>
+        <w:spacing w:after="0" w:before="0" w:line="360" w:lineRule="exact"/>
+        <w:ind w:firstLine="709" w:left="0" w:right="0"/>
+        <w:jc w:val="both"/>
+      </w:pPr>
+      <w:r>
+        <w:rPr>
+          <w:rFonts w:ascii="Times New Roman" w:hAnsi="Times New Roman"/>
+          <w:b w:val="0"/>
+          <w:color w:val="000000"/>
+          <w:sz w:val="28"/>
+        </w:rPr>
+        <w:t>Варианты использования описывают действия гостя и владельца бюджета. Сценарии связаны с функциональными требованиями через dependency; ссылки на ID также приведены в документации модели.</w:t>
+      </w:r>
+    </w:p>
+    <w:p>
+      <w:pPr>
+        <w:keepNext/>
+        <w:spacing w:after="0" w:before="0" w:line="240" w:lineRule="auto"/>
+        <w:ind w:firstLine="0" w:left="0" w:right="0"/>
+        <w:jc w:val="center"/>
+      </w:pPr>
+      <w:r>
+        <w:rPr>
+          <w:rFonts w:ascii="Times New Roman" w:hAnsi="Times New Roman"/>
+          <w:b w:val="0"/>
+          <w:color w:val="000000"/>
+          <w:sz w:val="28"/>
+        </w:rPr>
+      </w:r>
+      <w:r>
+        <w:drawing>
+          <wp:inline xmlns:a="http://schemas.openxmlformats.org/drawingml/2006/main" xmlns:pic="http://schemas.openxmlformats.org/drawingml/2006/picture">
+            <wp:extent cx="5940000" cy="7489445"/>
+            <wp:docPr id="2" name="Picture 2"/>
             <wp:cNvGraphicFramePr>
               <a:graphicFrameLocks noChangeAspect="1"/>
             </wp:cNvGraphicFramePr>
@@ -2448,7 +2550,8 @@
                     <pic:cNvPicPr/>
                   </pic:nvPicPr>
                   <pic:blipFill>
-                    <a:blip r:embed="rId20"/>
+                    <a:blip r:embed="rId21"/>
+                    <a:srcRect t="0" b="45500"/>
                     <a:stretch>
                       <a:fillRect/>
                     </a:stretch>
@@ -2456,7 +2559,7 @@
                   <pic:spPr>
                     <a:xfrm>
                       <a:off x="0" y="0"/>
-                      <a:ext cx="5760000" cy="3805714"/>
+                      <a:ext cx="5940000" cy="7489445"/>
                     </a:xfrm>
                     <a:prstGeom prst="rect"/>
                   </pic:spPr>
@@ -2481,41 +2584,7 @@
           <w:color w:val="000000"/>
           <w:sz w:val="28"/>
         </w:rPr>
-        <w:t>Рисунок 3.1 — Участник и варианты использования</w:t>
-      </w:r>
-    </w:p>
-    <w:p>
-      <w:pPr>
-        <w:keepNext w:val="0"/>
-        <w:spacing w:after="0" w:before="0" w:line="360" w:lineRule="exact"/>
-        <w:ind w:firstLine="709" w:left="0" w:right="0"/>
-        <w:jc w:val="both"/>
-      </w:pPr>
-      <w:r>
-        <w:rPr>
-          <w:rFonts w:ascii="Times New Roman" w:hAnsi="Times New Roman"/>
-          <w:b w:val="0"/>
-          <w:color w:val="000000"/>
-          <w:sz w:val="28"/>
-        </w:rPr>
-        <w:t>Каждый сценарий связан с требованиями через dependency. Связи satisfy задают назначение проектируемой системы удовлетворять требованиям; их наличие не означает, что реализация уже проверена.</w:t>
-      </w:r>
-    </w:p>
-    <w:p>
-      <w:pPr>
-        <w:keepNext w:val="0"/>
-        <w:spacing w:after="0" w:before="0" w:line="360" w:lineRule="exact"/>
-        <w:ind w:firstLine="709" w:left="0" w:right="0"/>
-        <w:jc w:val="both"/>
-      </w:pPr>
-      <w:r>
-        <w:rPr>
-          <w:rFonts w:ascii="Times New Roman" w:hAnsi="Times New Roman"/>
-          <w:b w:val="0"/>
-          <w:color w:val="000000"/>
-          <w:sz w:val="28"/>
-        </w:rPr>
-        <w:t>Синтаксис всей текстовой модели проверен парсером Ellidiss 1.0.0. Полный семантический анализ этим инструментальным сценарием не выполнялся. Графика является читаемой проекцией элементов исходной модели, а не изображением готового приложения.</w:t>
+        <w:t>Рисунок 3.2 — Варианты использования (начало)</w:t>
       </w:r>
     </w:p>
     <w:p>
@@ -2537,8 +2606,8 @@
       <w:r>
         <w:drawing>
           <wp:inline xmlns:a="http://schemas.openxmlformats.org/drawingml/2006/main" xmlns:pic="http://schemas.openxmlformats.org/drawingml/2006/picture">
-            <wp:extent cx="5760000" cy="7122857"/>
-            <wp:docPr id="2" name="Picture 2"/>
+            <wp:extent cx="5940000" cy="6252656"/>
+            <wp:docPr id="3" name="Picture 3"/>
             <wp:cNvGraphicFramePr>
               <a:graphicFrameLocks noChangeAspect="1"/>
             </wp:cNvGraphicFramePr>
@@ -2546,11 +2615,12 @@
               <a:graphicData uri="http://schemas.openxmlformats.org/drawingml/2006/picture">
                 <pic:pic>
                   <pic:nvPicPr>
-                    <pic:cNvPr id="0" name="functional-requirements.png"/>
+                    <pic:cNvPr id="0" name="use-cases.png"/>
                     <pic:cNvPicPr/>
                   </pic:nvPicPr>
                   <pic:blipFill>
                     <a:blip r:embed="rId21"/>
+                    <a:srcRect t="54500" b="0"/>
                     <a:stretch>
                       <a:fillRect/>
                     </a:stretch>
@@ -2558,7 +2628,7 @@
                   <pic:spPr>
                     <a:xfrm>
                       <a:off x="0" y="0"/>
-                      <a:ext cx="5760000" cy="7122857"/>
+                      <a:ext cx="5940000" cy="6252656"/>
                     </a:xfrm>
                     <a:prstGeom prst="rect"/>
                   </pic:spPr>
@@ -2583,16 +2653,15 @@
           <w:color w:val="000000"/>
           <w:sz w:val="28"/>
         </w:rPr>
-        <w:t>Рисунок 3.2 — Иерархия функциональных требований</w:t>
-      </w:r>
-    </w:p>
-    <w:p>
-      <w:pPr>
-        <w:keepNext/>
-        <w:pageBreakBefore/>
-        <w:spacing w:after="0" w:before="0" w:line="240" w:lineRule="auto"/>
-        <w:ind w:firstLine="0" w:left="0" w:right="0"/>
-        <w:jc w:val="center"/>
+        <w:t>Рисунок 3.2 — Варианты использования (окончание)</w:t>
+      </w:r>
+    </w:p>
+    <w:p>
+      <w:pPr>
+        <w:keepNext w:val="0"/>
+        <w:spacing w:after="0" w:before="0" w:line="360" w:lineRule="exact"/>
+        <w:ind w:firstLine="709" w:left="0" w:right="0"/>
+        <w:jc w:val="both"/>
       </w:pPr>
       <w:r>
         <w:rPr>
@@ -2601,12 +2670,65 @@
           <w:color w:val="000000"/>
           <w:sz w:val="28"/>
         </w:rPr>
+        <w:t>Диаграммы строятся командой %viz: interconnection для контекста и экранов, case для вариантов использования. PNG получены непосредственно из текстовых моделей. Невидимые связи PlantUML задают порядок блоков и размещение элементов строк. Длинная диаграмма вариантов использования разделена на два фрагмента для читаемости.</w:t>
+      </w:r>
+    </w:p>
+    <w:p>
+      <w:pPr>
+        <w:keepNext/>
+        <w:pageBreakBefore/>
+        <w:spacing w:after="360" w:before="0" w:line="360" w:lineRule="exact"/>
+        <w:ind w:firstLine="0" w:left="0" w:right="0"/>
+        <w:jc w:val="left"/>
+        <w:outlineLvl w:val="1"/>
+      </w:pPr>
+      <w:r>
+        <w:rPr>
+          <w:rFonts w:ascii="Times New Roman" w:hAnsi="Times New Roman"/>
+          <w:b/>
+          <w:color w:val="000000"/>
+          <w:sz w:val="28"/>
+        </w:rPr>
+        <w:t>3.5 Прототипы пользовательского интерфейса</w:t>
+      </w:r>
+    </w:p>
+    <w:p>
+      <w:pPr>
+        <w:keepNext w:val="0"/>
+        <w:spacing w:after="0" w:before="0" w:line="360" w:lineRule="exact"/>
+        <w:ind w:firstLine="709" w:left="0" w:right="0"/>
+        <w:jc w:val="both"/>
+      </w:pPr>
+      <w:r>
+        <w:rPr>
+          <w:rFonts w:ascii="Times New Roman" w:hAnsi="Times New Roman"/>
+          <w:b w:val="0"/>
+          <w:color w:val="000000"/>
+          <w:sz w:val="28"/>
+        </w:rPr>
+        <w:t>Шесть экранов используют общую библиотеку UiKit: Screen, Row, Form, Input, Select, Button, Link, Label и Banner. Поля содержат демонстрационные значения. Ошибки и альтернативные состояния включены в соответствующие модели.</w:t>
+      </w:r>
+    </w:p>
+    <w:p>
+      <w:pPr>
+        <w:keepNext/>
+        <w:spacing w:after="0" w:before="0" w:line="240" w:lineRule="auto"/>
+        <w:ind w:firstLine="0" w:left="0" w:right="0"/>
+        <w:jc w:val="center"/>
+      </w:pPr>
+      <w:r>
+        <w:rPr>
+          <w:rFonts w:ascii="Times New Roman" w:hAnsi="Times New Roman"/>
+          <w:b w:val="0"/>
+          <w:color w:val="000000"/>
+          <w:sz w:val="28"/>
+        </w:rPr>
       </w:r>
       <w:r>
         <w:drawing>
           <wp:inline xmlns:a="http://schemas.openxmlformats.org/drawingml/2006/main" xmlns:pic="http://schemas.openxmlformats.org/drawingml/2006/picture">
-            <wp:extent cx="5760000" cy="7354286"/>
-            <wp:docPr id="3" name="Picture 3"/>
+            <wp:extent cx="5940000" cy="3400649"/>
+            <wp:docPr id="4" name="Picture 4"/>
             <wp:cNvGraphicFramePr>
               <a:graphicFrameLocks noChangeAspect="1"/>
             </wp:cNvGraphicFramePr>
@@ -2614,7 +2736,7 @@
               <a:graphicData uri="http://schemas.openxmlformats.org/drawingml/2006/picture">
                 <pic:pic>
                   <pic:nvPicPr>
-                    <pic:cNvPr id="0" name="quality-requirements.png"/>
+                    <pic:cNvPr id="0" name="ui-01-auth.png"/>
                     <pic:cNvPicPr/>
                   </pic:nvPicPr>
                   <pic:blipFill>
@@ -2626,7 +2748,7 @@
                   <pic:spPr>
                     <a:xfrm>
                       <a:off x="0" y="0"/>
-                      <a:ext cx="5760000" cy="7354286"/>
+                      <a:ext cx="5940000" cy="3400649"/>
                     </a:xfrm>
                     <a:prstGeom prst="rect"/>
                   </pic:spPr>
@@ -2651,13 +2773,12 @@
           <w:color w:val="000000"/>
           <w:sz w:val="28"/>
         </w:rPr>
-        <w:t>Рисунок 3.3 — Иерархия нефункциональных требований</w:t>
+        <w:t>Рисунок 3.3 — Вход и регистрация</w:t>
       </w:r>
     </w:p>
     <w:p>
       <w:pPr>
         <w:keepNext w:val="0"/>
-        <w:pageBreakBefore/>
         <w:spacing w:after="0" w:before="0" w:line="360" w:lineRule="exact"/>
         <w:ind w:firstLine="709" w:left="0" w:right="0"/>
         <w:jc w:val="both"/>
@@ -2669,7 +2790,25 @@
           <w:color w:val="000000"/>
           <w:sz w:val="28"/>
         </w:rPr>
-        <w:t>Пять основных экранов описаны элементами Screen, атрибутами названия и пути к HTML-макету. Модель Navigation связывает обзор с остальными экранами. Для формы операции выделены редактирование, ошибка ввода и сохранение.</w:t>
+        <w:t>Для регистрации требуются уникальный адрес и пароль длиной 12–128 символов. При ошибке входа выводится общее сообщение; после пяти неудачных попыток за 15 минут вход временно блокируется.</w:t>
+      </w:r>
+    </w:p>
+    <w:p>
+      <w:pPr>
+        <w:keepNext w:val="0"/>
+        <w:pageBreakBefore/>
+        <w:spacing w:after="240" w:before="0" w:line="360" w:lineRule="exact"/>
+        <w:ind w:firstLine="709" w:left="0" w:right="0"/>
+        <w:jc w:val="both"/>
+      </w:pPr>
+      <w:r>
+        <w:rPr>
+          <w:rFonts w:ascii="Times New Roman" w:hAnsi="Times New Roman"/>
+          <w:b w:val="0"/>
+          <w:color w:val="000000"/>
+          <w:sz w:val="28"/>
+        </w:rPr>
+        <w:t>При начале учёта задаются дата и начальный остаток. На обзоре показаны фактические доходы и расходы, текущий остаток и ближайшие платежи. Для пустого бюджета и отрицательного остатка предусмотрены отдельные сообщения.</w:t>
       </w:r>
     </w:p>
     <w:p>
@@ -2690,8 +2829,8 @@
       <w:r>
         <w:drawing>
           <wp:inline xmlns:a="http://schemas.openxmlformats.org/drawingml/2006/main" xmlns:pic="http://schemas.openxmlformats.org/drawingml/2006/picture">
-            <wp:extent cx="5760000" cy="4011429"/>
-            <wp:docPr id="4" name="Picture 4"/>
+            <wp:extent cx="5940000" cy="6858664"/>
+            <wp:docPr id="5" name="Picture 5"/>
             <wp:cNvGraphicFramePr>
               <a:graphicFrameLocks noChangeAspect="1"/>
             </wp:cNvGraphicFramePr>
@@ -2699,7 +2838,7 @@
               <a:graphicData uri="http://schemas.openxmlformats.org/drawingml/2006/picture">
                 <pic:pic>
                   <pic:nvPicPr>
-                    <pic:cNvPr id="0" name="navigation.png"/>
+                    <pic:cNvPr id="0" name="ui-02-overview.png"/>
                     <pic:cNvPicPr/>
                   </pic:nvPicPr>
                   <pic:blipFill>
@@ -2711,7 +2850,7 @@
                   <pic:spPr>
                     <a:xfrm>
                       <a:off x="0" y="0"/>
-                      <a:ext cx="5760000" cy="4011429"/>
+                      <a:ext cx="5940000" cy="6858664"/>
                     </a:xfrm>
                     <a:prstGeom prst="rect"/>
                   </pic:spPr>
@@ -2736,13 +2875,14 @@
           <w:color w:val="000000"/>
           <w:sz w:val="28"/>
         </w:rPr>
-        <w:t>Рисунок 3.4 — Экраны и переходы</w:t>
+        <w:t>Рисунок 3.4 — Обзор бюджета</w:t>
       </w:r>
     </w:p>
     <w:p>
       <w:pPr>
         <w:keepNext w:val="0"/>
-        <w:spacing w:after="0" w:before="0" w:line="360" w:lineRule="exact"/>
+        <w:pageBreakBefore/>
+        <w:spacing w:after="240" w:before="0" w:line="360" w:lineRule="exact"/>
         <w:ind w:firstLine="709" w:left="0" w:right="0"/>
         <w:jc w:val="both"/>
       </w:pPr>
@@ -2753,16 +2893,15 @@
           <w:color w:val="000000"/>
           <w:sz w:val="28"/>
         </w:rPr>
-        <w:t>Переходы представлены событиями открытия экрана. Навигационные ссылки макетов позволяют пройти основные сценарии без подключения сервера. Сохранение и изменение данных в макетах не реализованы.</w:t>
-      </w:r>
-    </w:p>
-    <w:p>
-      <w:pPr>
-        <w:keepNext w:val="0"/>
-        <w:pageBreakBefore/>
-        <w:spacing w:after="0" w:before="0" w:line="360" w:lineRule="exact"/>
-        <w:ind w:firstLine="709" w:left="0" w:right="0"/>
-        <w:jc w:val="both"/>
+        <w:t>Экран содержит фильтры и форму ввода или редактирования. Удаление требует подтверждения. Некорректные поля не сохраняются; при ошибке сохранения введённые значения остаются в форме. Итоги относятся ко всей выборке.</w:t>
+      </w:r>
+    </w:p>
+    <w:p>
+      <w:pPr>
+        <w:keepNext/>
+        <w:spacing w:after="0" w:before="0" w:line="240" w:lineRule="auto"/>
+        <w:ind w:firstLine="0" w:left="0" w:right="0"/>
+        <w:jc w:val="center"/>
       </w:pPr>
       <w:r>
         <w:rPr>
@@ -2771,29 +2910,12 @@
           <w:color w:val="000000"/>
           <w:sz w:val="28"/>
         </w:rPr>
-        <w:t>Логическая модель предметной области выделяет пользователя, бюджет, категорию, операцию, лимит, правило регулярности и плановое вхождение. Суммы выражаются в копейках; начальный остаток не является доходом.</w:t>
-      </w:r>
-    </w:p>
-    <w:p>
-      <w:pPr>
-        <w:keepNext/>
-        <w:spacing w:after="0" w:before="0" w:line="240" w:lineRule="auto"/>
-        <w:ind w:firstLine="0" w:left="0" w:right="0"/>
-        <w:jc w:val="center"/>
-      </w:pPr>
-      <w:r>
-        <w:rPr>
-          <w:rFonts w:ascii="Times New Roman" w:hAnsi="Times New Roman"/>
-          <w:b w:val="0"/>
-          <w:color w:val="000000"/>
-          <w:sz w:val="28"/>
-        </w:rPr>
       </w:r>
       <w:r>
         <w:drawing>
           <wp:inline xmlns:a="http://schemas.openxmlformats.org/drawingml/2006/main" xmlns:pic="http://schemas.openxmlformats.org/drawingml/2006/picture">
-            <wp:extent cx="5760000" cy="5194286"/>
-            <wp:docPr id="5" name="Picture 5"/>
+            <wp:extent cx="5139692" cy="7560000"/>
+            <wp:docPr id="6" name="Picture 6"/>
             <wp:cNvGraphicFramePr>
               <a:graphicFrameLocks noChangeAspect="1"/>
             </wp:cNvGraphicFramePr>
@@ -2801,7 +2923,7 @@
               <a:graphicData uri="http://schemas.openxmlformats.org/drawingml/2006/picture">
                 <pic:pic>
                   <pic:nvPicPr>
-                    <pic:cNvPr id="0" name="domain.png"/>
+                    <pic:cNvPr id="0" name="ui-03-operations.png"/>
                     <pic:cNvPicPr/>
                   </pic:nvPicPr>
                   <pic:blipFill>
@@ -2813,7 +2935,7 @@
                   <pic:spPr>
                     <a:xfrm>
                       <a:off x="0" y="0"/>
-                      <a:ext cx="5760000" cy="5194286"/>
+                      <a:ext cx="5139692" cy="7560000"/>
                     </a:xfrm>
                     <a:prstGeom prst="rect"/>
                   </pic:spPr>
@@ -2838,13 +2960,14 @@
           <w:color w:val="000000"/>
           <w:sz w:val="28"/>
         </w:rPr>
-        <w:t>Рисунок 3.5 — Модель предметной области</w:t>
+        <w:t>Рисунок 3.5 — Операции</w:t>
       </w:r>
     </w:p>
     <w:p>
       <w:pPr>
         <w:keepNext w:val="0"/>
-        <w:spacing w:after="0" w:before="0" w:line="360" w:lineRule="exact"/>
+        <w:pageBreakBefore/>
+        <w:spacing w:after="240" w:before="0" w:line="360" w:lineRule="exact"/>
         <w:ind w:firstLine="709" w:left="0" w:right="0"/>
         <w:jc w:val="both"/>
       </w:pPr>
@@ -2855,34 +2978,15 @@
           <w:color w:val="000000"/>
           <w:sz w:val="28"/>
         </w:rPr>
-        <w:t>Плановое вхождение связывается не более чем с одной фактической операцией. Обратное ограничение также равно одному. Это исключает повторное исполнение одного платежа и двойное использование операции.</w:t>
+        <w:t>Категории разделены на доходы и расходы. Архивирование сохраняет историю. Месячный лимит показывает достижение или превышение, но не запрещает записывать фактический расход.</w:t>
       </w:r>
     </w:p>
     <w:p>
       <w:pPr>
         <w:keepNext/>
-        <w:pageBreakBefore/>
-        <w:spacing w:after="360" w:before="0" w:line="360" w:lineRule="exact"/>
+        <w:spacing w:after="0" w:before="0" w:line="240" w:lineRule="auto"/>
         <w:ind w:firstLine="0" w:left="0" w:right="0"/>
-        <w:jc w:val="left"/>
-        <w:outlineLvl w:val="1"/>
-      </w:pPr>
-      <w:r>
-        <w:rPr>
-          <w:rFonts w:ascii="Times New Roman" w:hAnsi="Times New Roman"/>
-          <w:b/>
-          <w:color w:val="000000"/>
-          <w:sz w:val="28"/>
-        </w:rPr>
-        <w:t>3.5 Прототипы пользовательского интерфейса</w:t>
-      </w:r>
-    </w:p>
-    <w:p>
-      <w:pPr>
-        <w:keepNext w:val="0"/>
-        <w:spacing w:after="120" w:before="0" w:line="360" w:lineRule="exact"/>
-        <w:ind w:firstLine="709" w:left="0" w:right="0"/>
-        <w:jc w:val="both"/>
+        <w:jc w:val="center"/>
       </w:pPr>
       <w:r>
         <w:rPr>
@@ -2891,29 +2995,12 @@
           <w:color w:val="000000"/>
           <w:sz w:val="28"/>
         </w:rPr>
-        <w:t>Подготовлены пять основных макетов и три варианта состояний. Данные вымышленные; дата 26.10.2026 используется для контрольного примера с пятью оставшимися днями месяца.</w:t>
-      </w:r>
-    </w:p>
-    <w:p>
-      <w:pPr>
-        <w:keepNext/>
-        <w:spacing w:after="0" w:before="0" w:line="240" w:lineRule="auto"/>
-        <w:ind w:firstLine="0" w:left="0" w:right="0"/>
-        <w:jc w:val="center"/>
-      </w:pPr>
-      <w:r>
-        <w:rPr>
-          <w:rFonts w:ascii="Times New Roman" w:hAnsi="Times New Roman"/>
-          <w:b w:val="0"/>
-          <w:color w:val="000000"/>
-          <w:sz w:val="28"/>
-        </w:rPr>
       </w:r>
       <w:r>
         <w:drawing>
           <wp:inline xmlns:a="http://schemas.openxmlformats.org/drawingml/2006/main" xmlns:pic="http://schemas.openxmlformats.org/drawingml/2006/picture">
-            <wp:extent cx="5184000" cy="3655200"/>
-            <wp:docPr id="6" name="Picture 6"/>
+            <wp:extent cx="5940000" cy="6680969"/>
+            <wp:docPr id="7" name="Picture 7"/>
             <wp:cNvGraphicFramePr>
               <a:graphicFrameLocks noChangeAspect="1"/>
             </wp:cNvGraphicFramePr>
@@ -2921,7 +3008,7 @@
               <a:graphicData uri="http://schemas.openxmlformats.org/drawingml/2006/picture">
                 <pic:pic>
                   <pic:nvPicPr>
-                    <pic:cNvPr id="0" name="dashboard.png"/>
+                    <pic:cNvPr id="0" name="ui-04-budget.png"/>
                     <pic:cNvPicPr/>
                   </pic:nvPicPr>
                   <pic:blipFill>
@@ -2933,7 +3020,7 @@
                   <pic:spPr>
                     <a:xfrm>
                       <a:off x="0" y="0"/>
-                      <a:ext cx="5184000" cy="3655200"/>
+                      <a:ext cx="5940000" cy="6680969"/>
                     </a:xfrm>
                     <a:prstGeom prst="rect"/>
                   </pic:spPr>
@@ -2958,7 +3045,25 @@
           <w:color w:val="000000"/>
           <w:sz w:val="28"/>
         </w:rPr>
-        <w:t>Рисунок 3.6 — Обзор бюджета</w:t>
+        <w:t>Рисунок 3.6 — Категории и лимиты</w:t>
+      </w:r>
+    </w:p>
+    <w:p>
+      <w:pPr>
+        <w:keepNext w:val="0"/>
+        <w:pageBreakBefore/>
+        <w:spacing w:after="240" w:before="0" w:line="360" w:lineRule="exact"/>
+        <w:ind w:firstLine="709" w:left="0" w:right="0"/>
+        <w:jc w:val="both"/>
+      </w:pPr>
+      <w:r>
+        <w:rPr>
+          <w:rFonts w:ascii="Times New Roman" w:hAnsi="Times New Roman"/>
+          <w:b w:val="0"/>
+          <w:color w:val="000000"/>
+          <w:sz w:val="28"/>
+        </w:rPr>
+        <w:t>Регулярное правило формирует отдельные вхождения. Подтверждение создаёт операцию или связывает существующую. Просроченный платёж остаётся в прогнозе до исполнения, пропуска или переноса; повторное подтверждение не создаёт второй расход.</w:t>
       </w:r>
     </w:p>
     <w:p>
@@ -2979,8 +3084,8 @@
       <w:r>
         <w:drawing>
           <wp:inline xmlns:a="http://schemas.openxmlformats.org/drawingml/2006/main" xmlns:pic="http://schemas.openxmlformats.org/drawingml/2006/picture">
-            <wp:extent cx="5184000" cy="3240000"/>
-            <wp:docPr id="7" name="Picture 7"/>
+            <wp:extent cx="5800526" cy="7560000"/>
+            <wp:docPr id="8" name="Picture 8"/>
             <wp:cNvGraphicFramePr>
               <a:graphicFrameLocks noChangeAspect="1"/>
             </wp:cNvGraphicFramePr>
@@ -2988,7 +3093,7 @@
               <a:graphicData uri="http://schemas.openxmlformats.org/drawingml/2006/picture">
                 <pic:pic>
                   <pic:nvPicPr>
-                    <pic:cNvPr id="0" name="operations.png"/>
+                    <pic:cNvPr id="0" name="ui-05-payments.png"/>
                     <pic:cNvPicPr/>
                   </pic:nvPicPr>
                   <pic:blipFill>
@@ -3000,7 +3105,7 @@
                   <pic:spPr>
                     <a:xfrm>
                       <a:off x="0" y="0"/>
-                      <a:ext cx="5184000" cy="3240000"/>
+                      <a:ext cx="5800526" cy="7560000"/>
                     </a:xfrm>
                     <a:prstGeom prst="rect"/>
                   </pic:spPr>
@@ -3025,14 +3130,14 @@
           <w:color w:val="000000"/>
           <w:sz w:val="28"/>
         </w:rPr>
-        <w:t>Рисунок 3.7 — Операции и форма ввода</w:t>
+        <w:t>Рисунок 3.7 — Плановые платежи</w:t>
       </w:r>
     </w:p>
     <w:p>
       <w:pPr>
         <w:keepNext w:val="0"/>
         <w:pageBreakBefore/>
-        <w:spacing w:after="120" w:before="0" w:line="360" w:lineRule="exact"/>
+        <w:spacing w:after="240" w:before="0" w:line="360" w:lineRule="exact"/>
         <w:ind w:firstLine="709" w:left="0" w:right="0"/>
         <w:jc w:val="both"/>
       </w:pPr>
@@ -3043,7 +3148,7 @@
           <w:color w:val="000000"/>
           <w:sz w:val="28"/>
         </w:rPr>
-        <w:t>Бюджет показывает расходы по категориям и превышения лимитов. Экран платежей разделяет ожидаемые и исполненные вхождения; подтверждение связывает план с фактом.</w:t>
+        <w:t>Показаны структура расходов, сравнение периодов и оба прогноза с исходными суммами. При отсутствии полного месяца числовые прогнозы отсутствуют. Данные контрольного примера относятся к 26 октября 2026 года.</w:t>
       </w:r>
     </w:p>
     <w:p>
@@ -3064,8 +3169,8 @@
       <w:r>
         <w:drawing>
           <wp:inline xmlns:a="http://schemas.openxmlformats.org/drawingml/2006/main" xmlns:pic="http://schemas.openxmlformats.org/drawingml/2006/picture">
-            <wp:extent cx="5292000" cy="3763200"/>
-            <wp:docPr id="8" name="Picture 8"/>
+            <wp:extent cx="5857204" cy="7560000"/>
+            <wp:docPr id="9" name="Picture 9"/>
             <wp:cNvGraphicFramePr>
               <a:graphicFrameLocks noChangeAspect="1"/>
             </wp:cNvGraphicFramePr>
@@ -3073,7 +3178,7 @@
               <a:graphicData uri="http://schemas.openxmlformats.org/drawingml/2006/picture">
                 <pic:pic>
                   <pic:nvPicPr>
-                    <pic:cNvPr id="0" name="budget.png"/>
+                    <pic:cNvPr id="0" name="ui-06-forecast.png"/>
                     <pic:cNvPicPr/>
                   </pic:nvPicPr>
                   <pic:blipFill>
@@ -3085,7 +3190,7 @@
                   <pic:spPr>
                     <a:xfrm>
                       <a:off x="0" y="0"/>
-                      <a:ext cx="5292000" cy="3763200"/>
+                      <a:ext cx="5857204" cy="7560000"/>
                     </a:xfrm>
                     <a:prstGeom prst="rect"/>
                   </pic:spPr>
@@ -3110,378 +3215,7 @@
           <w:color w:val="000000"/>
           <w:sz w:val="28"/>
         </w:rPr>
-        <w:t>Рисунок 3.8 — Категории и лимиты</w:t>
-      </w:r>
-    </w:p>
-    <w:p>
-      <w:pPr>
-        <w:keepNext/>
-        <w:spacing w:after="0" w:before="0" w:line="240" w:lineRule="auto"/>
-        <w:ind w:firstLine="0" w:left="0" w:right="0"/>
-        <w:jc w:val="center"/>
-      </w:pPr>
-      <w:r>
-        <w:rPr>
-          <w:rFonts w:ascii="Times New Roman" w:hAnsi="Times New Roman"/>
-          <w:b w:val="0"/>
-          <w:color w:val="000000"/>
-          <w:sz w:val="28"/>
-        </w:rPr>
-      </w:r>
-      <w:r>
-        <w:drawing>
-          <wp:inline xmlns:a="http://schemas.openxmlformats.org/drawingml/2006/main" xmlns:pic="http://schemas.openxmlformats.org/drawingml/2006/picture">
-            <wp:extent cx="5292000" cy="3547600"/>
-            <wp:docPr id="9" name="Picture 9"/>
-            <wp:cNvGraphicFramePr>
-              <a:graphicFrameLocks noChangeAspect="1"/>
-            </wp:cNvGraphicFramePr>
-            <a:graphic>
-              <a:graphicData uri="http://schemas.openxmlformats.org/drawingml/2006/picture">
-                <pic:pic>
-                  <pic:nvPicPr>
-                    <pic:cNvPr id="0" name="scheduled.png"/>
-                    <pic:cNvPicPr/>
-                  </pic:nvPicPr>
-                  <pic:blipFill>
-                    <a:blip r:embed="rId28"/>
-                    <a:stretch>
-                      <a:fillRect/>
-                    </a:stretch>
-                  </pic:blipFill>
-                  <pic:spPr>
-                    <a:xfrm>
-                      <a:off x="0" y="0"/>
-                      <a:ext cx="5292000" cy="3547600"/>
-                    </a:xfrm>
-                    <a:prstGeom prst="rect"/>
-                  </pic:spPr>
-                </pic:pic>
-              </a:graphicData>
-            </a:graphic>
-          </wp:inline>
-        </w:drawing>
-      </w:r>
-    </w:p>
-    <w:p>
-      <w:pPr>
-        <w:keepNext w:val="0"/>
-        <w:spacing w:after="240" w:before="0" w:line="360" w:lineRule="exact"/>
-        <w:ind w:firstLine="0" w:left="0" w:right="0"/>
-        <w:jc w:val="center"/>
-      </w:pPr>
-      <w:r>
-        <w:rPr>
-          <w:rFonts w:ascii="Times New Roman" w:hAnsi="Times New Roman"/>
-          <w:b w:val="0"/>
-          <w:color w:val="000000"/>
-          <w:sz w:val="28"/>
-        </w:rPr>
-        <w:t>Рисунок 3.9 — Плановые платежи</w:t>
-      </w:r>
-    </w:p>
-    <w:p>
-      <w:pPr>
-        <w:keepNext w:val="0"/>
-        <w:pageBreakBefore/>
-        <w:spacing w:after="120" w:before="0" w:line="360" w:lineRule="exact"/>
-        <w:ind w:firstLine="709" w:left="0" w:right="0"/>
-        <w:jc w:val="both"/>
-      </w:pPr>
-      <w:r>
-        <w:rPr>
-          <w:rFonts w:ascii="Times New Roman" w:hAnsi="Times New Roman"/>
-          <w:b w:val="0"/>
-          <w:color w:val="000000"/>
-          <w:sz w:val="28"/>
-        </w:rPr>
-        <w:t>Экран прогноза показывает результаты и все слагаемые расчёта. При недостаточной истории вместо чисел выводится причина и объяснение, когда появится полный месяц учёта.</w:t>
-      </w:r>
-    </w:p>
-    <w:p>
-      <w:pPr>
-        <w:keepNext/>
-        <w:spacing w:after="0" w:before="0" w:line="240" w:lineRule="auto"/>
-        <w:ind w:firstLine="0" w:left="0" w:right="0"/>
-        <w:jc w:val="center"/>
-      </w:pPr>
-      <w:r>
-        <w:rPr>
-          <w:rFonts w:ascii="Times New Roman" w:hAnsi="Times New Roman"/>
-          <w:b w:val="0"/>
-          <w:color w:val="000000"/>
-          <w:sz w:val="28"/>
-        </w:rPr>
-      </w:r>
-      <w:r>
-        <w:drawing>
-          <wp:inline xmlns:a="http://schemas.openxmlformats.org/drawingml/2006/main" xmlns:pic="http://schemas.openxmlformats.org/drawingml/2006/picture">
-            <wp:extent cx="5292000" cy="3667650"/>
-            <wp:docPr id="10" name="Picture 10"/>
-            <wp:cNvGraphicFramePr>
-              <a:graphicFrameLocks noChangeAspect="1"/>
-            </wp:cNvGraphicFramePr>
-            <a:graphic>
-              <a:graphicData uri="http://schemas.openxmlformats.org/drawingml/2006/picture">
-                <pic:pic>
-                  <pic:nvPicPr>
-                    <pic:cNvPr id="0" name="forecast.png"/>
-                    <pic:cNvPicPr/>
-                  </pic:nvPicPr>
-                  <pic:blipFill>
-                    <a:blip r:embed="rId29"/>
-                    <a:stretch>
-                      <a:fillRect/>
-                    </a:stretch>
-                  </pic:blipFill>
-                  <pic:spPr>
-                    <a:xfrm>
-                      <a:off x="0" y="0"/>
-                      <a:ext cx="5292000" cy="3667650"/>
-                    </a:xfrm>
-                    <a:prstGeom prst="rect"/>
-                  </pic:spPr>
-                </pic:pic>
-              </a:graphicData>
-            </a:graphic>
-          </wp:inline>
-        </w:drawing>
-      </w:r>
-    </w:p>
-    <w:p>
-      <w:pPr>
-        <w:keepNext w:val="0"/>
-        <w:spacing w:after="240" w:before="0" w:line="360" w:lineRule="exact"/>
-        <w:ind w:firstLine="0" w:left="0" w:right="0"/>
-        <w:jc w:val="center"/>
-      </w:pPr>
-      <w:r>
-        <w:rPr>
-          <w:rFonts w:ascii="Times New Roman" w:hAnsi="Times New Roman"/>
-          <w:b w:val="0"/>
-          <w:color w:val="000000"/>
-          <w:sz w:val="28"/>
-        </w:rPr>
-        <w:t>Рисунок 3.10 — Аналитика и оба прогноза</w:t>
-      </w:r>
-    </w:p>
-    <w:p>
-      <w:pPr>
-        <w:keepNext/>
-        <w:spacing w:after="0" w:before="0" w:line="240" w:lineRule="auto"/>
-        <w:ind w:firstLine="0" w:left="0" w:right="0"/>
-        <w:jc w:val="center"/>
-      </w:pPr>
-      <w:r>
-        <w:rPr>
-          <w:rFonts w:ascii="Times New Roman" w:hAnsi="Times New Roman"/>
-          <w:b w:val="0"/>
-          <w:color w:val="000000"/>
-          <w:sz w:val="28"/>
-        </w:rPr>
-      </w:r>
-      <w:r>
-        <w:drawing>
-          <wp:inline xmlns:a="http://schemas.openxmlformats.org/drawingml/2006/main" xmlns:pic="http://schemas.openxmlformats.org/drawingml/2006/picture">
-            <wp:extent cx="5292000" cy="3307500"/>
-            <wp:docPr id="11" name="Picture 11"/>
-            <wp:cNvGraphicFramePr>
-              <a:graphicFrameLocks noChangeAspect="1"/>
-            </wp:cNvGraphicFramePr>
-            <a:graphic>
-              <a:graphicData uri="http://schemas.openxmlformats.org/drawingml/2006/picture">
-                <pic:pic>
-                  <pic:nvPicPr>
-                    <pic:cNvPr id="0" name="no-history.png"/>
-                    <pic:cNvPicPr/>
-                  </pic:nvPicPr>
-                  <pic:blipFill>
-                    <a:blip r:embed="rId30"/>
-                    <a:stretch>
-                      <a:fillRect/>
-                    </a:stretch>
-                  </pic:blipFill>
-                  <pic:spPr>
-                    <a:xfrm>
-                      <a:off x="0" y="0"/>
-                      <a:ext cx="5292000" cy="3307500"/>
-                    </a:xfrm>
-                    <a:prstGeom prst="rect"/>
-                  </pic:spPr>
-                </pic:pic>
-              </a:graphicData>
-            </a:graphic>
-          </wp:inline>
-        </w:drawing>
-      </w:r>
-    </w:p>
-    <w:p>
-      <w:pPr>
-        <w:keepNext w:val="0"/>
-        <w:spacing w:after="240" w:before="0" w:line="360" w:lineRule="exact"/>
-        <w:ind w:firstLine="0" w:left="0" w:right="0"/>
-        <w:jc w:val="center"/>
-      </w:pPr>
-      <w:r>
-        <w:rPr>
-          <w:rFonts w:ascii="Times New Roman" w:hAnsi="Times New Roman"/>
-          <w:b w:val="0"/>
-          <w:color w:val="000000"/>
-          <w:sz w:val="28"/>
-        </w:rPr>
-        <w:t>Рисунок 3.11 — Недостаточно истории</w:t>
-      </w:r>
-    </w:p>
-    <w:p>
-      <w:pPr>
-        <w:keepNext w:val="0"/>
-        <w:pageBreakBefore/>
-        <w:spacing w:after="120" w:before="0" w:line="360" w:lineRule="exact"/>
-        <w:ind w:firstLine="709" w:left="0" w:right="0"/>
-        <w:jc w:val="both"/>
-      </w:pPr>
-      <w:r>
-        <w:rPr>
-          <w:rFonts w:ascii="Times New Roman" w:hAnsi="Times New Roman"/>
-          <w:b w:val="0"/>
-          <w:color w:val="000000"/>
-          <w:sz w:val="28"/>
-        </w:rPr>
-        <w:t>При ошибке ввода сохраняются заполненные значения и указывается способ исправления. Для пустого списка предусмотрено действие добавления первой операции.</w:t>
-      </w:r>
-    </w:p>
-    <w:p>
-      <w:pPr>
-        <w:keepNext/>
-        <w:spacing w:after="0" w:before="0" w:line="240" w:lineRule="auto"/>
-        <w:ind w:firstLine="0" w:left="0" w:right="0"/>
-        <w:jc w:val="center"/>
-      </w:pPr>
-      <w:r>
-        <w:rPr>
-          <w:rFonts w:ascii="Times New Roman" w:hAnsi="Times New Roman"/>
-          <w:b w:val="0"/>
-          <w:color w:val="000000"/>
-          <w:sz w:val="28"/>
-        </w:rPr>
-      </w:r>
-      <w:r>
-        <w:drawing>
-          <wp:inline xmlns:a="http://schemas.openxmlformats.org/drawingml/2006/main" xmlns:pic="http://schemas.openxmlformats.org/drawingml/2006/picture">
-            <wp:extent cx="5292000" cy="3307500"/>
-            <wp:docPr id="12" name="Picture 12"/>
-            <wp:cNvGraphicFramePr>
-              <a:graphicFrameLocks noChangeAspect="1"/>
-            </wp:cNvGraphicFramePr>
-            <a:graphic>
-              <a:graphicData uri="http://schemas.openxmlformats.org/drawingml/2006/picture">
-                <pic:pic>
-                  <pic:nvPicPr>
-                    <pic:cNvPr id="0" name="input-error.png"/>
-                    <pic:cNvPicPr/>
-                  </pic:nvPicPr>
-                  <pic:blipFill>
-                    <a:blip r:embed="rId31"/>
-                    <a:stretch>
-                      <a:fillRect/>
-                    </a:stretch>
-                  </pic:blipFill>
-                  <pic:spPr>
-                    <a:xfrm>
-                      <a:off x="0" y="0"/>
-                      <a:ext cx="5292000" cy="3307500"/>
-                    </a:xfrm>
-                    <a:prstGeom prst="rect"/>
-                  </pic:spPr>
-                </pic:pic>
-              </a:graphicData>
-            </a:graphic>
-          </wp:inline>
-        </w:drawing>
-      </w:r>
-    </w:p>
-    <w:p>
-      <w:pPr>
-        <w:keepNext w:val="0"/>
-        <w:spacing w:after="240" w:before="0" w:line="360" w:lineRule="exact"/>
-        <w:ind w:firstLine="0" w:left="0" w:right="0"/>
-        <w:jc w:val="center"/>
-      </w:pPr>
-      <w:r>
-        <w:rPr>
-          <w:rFonts w:ascii="Times New Roman" w:hAnsi="Times New Roman"/>
-          <w:b w:val="0"/>
-          <w:color w:val="000000"/>
-          <w:sz w:val="28"/>
-        </w:rPr>
-        <w:t>Рисунок 3.12 — Ошибка ввода суммы</w:t>
-      </w:r>
-    </w:p>
-    <w:p>
-      <w:pPr>
-        <w:keepNext/>
-        <w:spacing w:after="0" w:before="0" w:line="240" w:lineRule="auto"/>
-        <w:ind w:firstLine="0" w:left="0" w:right="0"/>
-        <w:jc w:val="center"/>
-      </w:pPr>
-      <w:r>
-        <w:rPr>
-          <w:rFonts w:ascii="Times New Roman" w:hAnsi="Times New Roman"/>
-          <w:b w:val="0"/>
-          <w:color w:val="000000"/>
-          <w:sz w:val="28"/>
-        </w:rPr>
-      </w:r>
-      <w:r>
-        <w:drawing>
-          <wp:inline xmlns:a="http://schemas.openxmlformats.org/drawingml/2006/main" xmlns:pic="http://schemas.openxmlformats.org/drawingml/2006/picture">
-            <wp:extent cx="5292000" cy="3307500"/>
-            <wp:docPr id="13" name="Picture 13"/>
-            <wp:cNvGraphicFramePr>
-              <a:graphicFrameLocks noChangeAspect="1"/>
-            </wp:cNvGraphicFramePr>
-            <a:graphic>
-              <a:graphicData uri="http://schemas.openxmlformats.org/drawingml/2006/picture">
-                <pic:pic>
-                  <pic:nvPicPr>
-                    <pic:cNvPr id="0" name="empty.png"/>
-                    <pic:cNvPicPr/>
-                  </pic:nvPicPr>
-                  <pic:blipFill>
-                    <a:blip r:embed="rId32"/>
-                    <a:stretch>
-                      <a:fillRect/>
-                    </a:stretch>
-                  </pic:blipFill>
-                  <pic:spPr>
-                    <a:xfrm>
-                      <a:off x="0" y="0"/>
-                      <a:ext cx="5292000" cy="3307500"/>
-                    </a:xfrm>
-                    <a:prstGeom prst="rect"/>
-                  </pic:spPr>
-                </pic:pic>
-              </a:graphicData>
-            </a:graphic>
-          </wp:inline>
-        </w:drawing>
-      </w:r>
-    </w:p>
-    <w:p>
-      <w:pPr>
-        <w:keepNext w:val="0"/>
-        <w:spacing w:after="240" w:before="0" w:line="360" w:lineRule="exact"/>
-        <w:ind w:firstLine="0" w:left="0" w:right="0"/>
-        <w:jc w:val="center"/>
-      </w:pPr>
-      <w:r>
-        <w:rPr>
-          <w:rFonts w:ascii="Times New Roman" w:hAnsi="Times New Roman"/>
-          <w:b w:val="0"/>
-          <w:color w:val="000000"/>
-          <w:sz w:val="28"/>
-        </w:rPr>
-        <w:t>Рисунок 3.13 — Пустой список операций</w:t>
+        <w:t>Рисунок 3.8 — Аналитика и прогнозы</w:t>
       </w:r>
     </w:p>
     <w:p>
@@ -3517,7 +3251,7 @@
           <w:color w:val="000000"/>
           <w:sz w:val="28"/>
         </w:rPr>
-        <w:t>Спецификация srs/srs.md версии 0.2 содержит 18 функциональных и 19 нефункциональных требований. Каждое имеет ID, формулировку, обоснование, критерии приёмки и метод верификации. Все требования реализации имеют статус «Запланировано».</w:t>
+        <w:t>Спецификация srs/srs.md версии 0.3 содержит 18 функциональных и 19 нефункциональных требований. Каждое имеет ID, формулировку, обоснование, критерии приёмки и метод верификации. Все требования реализации имеют статус «Запланировано».</w:t>
       </w:r>
     </w:p>
     <w:p>
@@ -5829,7 +5563,7 @@
           <w:color w:val="000000"/>
           <w:sz w:val="28"/>
         </w:rPr>
-        <w:t>Редакция 0.1 и предварительное интервью зафиксированы отдельным коммитом. Следующая редакция включает изменения после модельной рецензии, графику, проверочные сценарии и отчёт. Ветка опубликована для внешнего рецензирования.</w:t>
+        <w:t>История Git сохраняет предыдущие редакции. В SRS 0.3 функциональные требования сгруппированы по возможностям продукта, введены оглавление и пять приложений. Графика заменена экспортом SysML v2 Pilot; комплект включает исходники и инструменты воспроизведения.</w:t>
       </w:r>
     </w:p>
     <w:p>
@@ -5865,7 +5599,7 @@
           <w:color w:val="000000"/>
           <w:sz w:val="28"/>
         </w:rPr>
-        <w:t>3.8 Рецензирование и внесение изменений</w:t>
+        <w:t>3.8 Проверка и уточнение требований</w:t>
       </w:r>
     </w:p>
     <w:p>
@@ -5882,7 +5616,7 @@
           <w:color w:val="000000"/>
           <w:sz w:val="28"/>
         </w:rPr>
-        <w:t>Предварительная рецензия выполнена ассистентом в роли заказчика. Она позволяет проверить согласованность требований до передачи напарнику. Рецензия Новицкого Е. Ю. и замечания преподавателя на момент подготовки отчёта ожидаются.</w:t>
+        <w:t>Проверены постоянство ID, совпадение формулировок между реестром, SRS и моделью, наличие сценариев и матрицы верификации. Контрольные суммы связывают PNG с использованными исходниками. Содержание требований сохранено; ссылка на правила расчёта перенесена в раздел 3.2.8.</w:t>
       </w:r>
     </w:p>
     <w:p>
@@ -5899,7 +5633,7 @@
           <w:color w:val="000000"/>
           <w:sz w:val="28"/>
         </w:rPr>
-        <w:t>Таблица 3.5 — Предварительные замечания</w:t>
+        <w:t>Таблица 3.5 — Проверки документации</w:t>
       </w:r>
     </w:p>
     <w:tbl>
@@ -5918,9 +5652,8 @@
         </w:tblBorders>
       </w:tblPr>
       <w:tblGrid>
-        <w:gridCol w:w="850"/>
-        <w:gridCol w:w="4649"/>
-        <w:gridCol w:w="3855"/>
+        <w:gridCol w:w="3288"/>
+        <w:gridCol w:w="6066"/>
       </w:tblGrid>
       <w:tr>
         <w:trPr>
@@ -5929,7 +5662,7 @@
         </w:trPr>
         <w:tc>
           <w:tcPr>
-            <w:tcW w:type="dxa" w:w="850"/>
+            <w:tcW w:type="dxa" w:w="3288"/>
             <w:vAlign w:val="center"/>
             <w:tcMar>
               <w:top w:w="40" w:type="dxa"/>
@@ -5950,13 +5683,13 @@
                 <w:b/>
                 <w:sz w:val="24"/>
               </w:rPr>
-              <w:t>ID</w:t>
+              <w:t>Проверка</w:t>
             </w:r>
           </w:p>
         </w:tc>
         <w:tc>
           <w:tcPr>
-            <w:tcW w:type="dxa" w:w="4649"/>
+            <w:tcW w:type="dxa" w:w="6066"/>
             <w:vAlign w:val="center"/>
             <w:tcMar>
               <w:top w:w="40" w:type="dxa"/>
@@ -5977,34 +5710,7 @@
                 <w:b/>
                 <w:sz w:val="24"/>
               </w:rPr>
-              <w:t>Замечание</w:t>
-            </w:r>
-          </w:p>
-        </w:tc>
-        <w:tc>
-          <w:tcPr>
-            <w:tcW w:type="dxa" w:w="3855"/>
-            <w:vAlign w:val="center"/>
-            <w:tcMar>
-              <w:top w:w="40" w:type="dxa"/>
-              <w:left w:w="70" w:type="dxa"/>
-              <w:bottom w:w="40" w:type="dxa"/>
-              <w:right w:w="70" w:type="dxa"/>
-            </w:tcMar>
-          </w:tcPr>
-          <w:p>
-            <w:pPr>
-              <w:spacing w:after="40" w:before="40" w:line="240" w:lineRule="auto"/>
-              <w:ind w:firstLine="0"/>
-              <w:jc w:val="left"/>
-            </w:pPr>
-            <w:r>
-              <w:rPr>
-                <w:rFonts w:ascii="Times New Roman" w:hAnsi="Times New Roman"/>
-                <w:b/>
-                <w:sz w:val="24"/>
-              </w:rPr>
-              <w:t>Решение</w:t>
+              <w:t>Результат</w:t>
             </w:r>
           </w:p>
         </w:tc>
@@ -6015,7 +5721,7 @@
         </w:trPr>
         <w:tc>
           <w:tcPr>
-            <w:tcW w:type="dxa" w:w="850"/>
+            <w:tcW w:type="dxa" w:w="3288"/>
             <w:vAlign w:val="center"/>
             <w:tcMar>
               <w:top w:w="40" w:type="dxa"/>
@@ -6036,13 +5742,13 @@
                 <w:b w:val="0"/>
                 <w:sz w:val="24"/>
               </w:rPr>
-              <w:t>R-01</w:t>
+              <w:t>37 ID и формулировки</w:t>
             </w:r>
           </w:p>
         </w:tc>
         <w:tc>
           <w:tcPr>
-            <w:tcW w:type="dxa" w:w="4649"/>
+            <w:tcW w:type="dxa" w:w="6066"/>
             <w:vAlign w:val="center"/>
             <w:tcMar>
               <w:top w:w="40" w:type="dxa"/>
@@ -6063,13 +5769,18 @@
                 <w:b w:val="0"/>
                 <w:sz w:val="24"/>
               </w:rPr>
-              <w:t>Повторное подтверждение или связь одной операции с двумя платежами</w:t>
+              <w:t>Совпадают между реестром, SRS и моделью</w:t>
             </w:r>
           </w:p>
         </w:tc>
+      </w:tr>
+      <w:tr>
+        <w:trPr>
+          <w:cantSplit/>
+        </w:trPr>
         <w:tc>
           <w:tcPr>
-            <w:tcW w:type="dxa" w:w="3855"/>
+            <w:tcW w:type="dxa" w:w="3288"/>
             <w:vAlign w:val="center"/>
             <w:tcMar>
               <w:top w:w="40" w:type="dxa"/>
@@ -6090,18 +5801,13 @@
                 <w:b w:val="0"/>
                 <w:sz w:val="24"/>
               </w:rPr>
-              <w:t>Принято; уточнён REQ-FUNC-013</w:t>
+              <w:t>37 связей satisfy</w:t>
             </w:r>
           </w:p>
         </w:tc>
-      </w:tr>
-      <w:tr>
-        <w:trPr>
-          <w:cantSplit/>
-        </w:trPr>
         <w:tc>
           <w:tcPr>
-            <w:tcW w:type="dxa" w:w="850"/>
+            <w:tcW w:type="dxa" w:w="6066"/>
             <w:vAlign w:val="center"/>
             <w:tcMar>
               <w:top w:w="40" w:type="dxa"/>
@@ -6122,13 +5828,18 @@
                 <w:b w:val="0"/>
                 <w:sz w:val="24"/>
               </w:rPr>
-              <w:t>R-02</w:t>
+              <w:t>Присутствуют в модели требований</w:t>
             </w:r>
           </w:p>
         </w:tc>
+      </w:tr>
+      <w:tr>
+        <w:trPr>
+          <w:cantSplit/>
+        </w:trPr>
         <w:tc>
           <w:tcPr>
-            <w:tcW w:type="dxa" w:w="4649"/>
+            <w:tcW w:type="dxa" w:w="3288"/>
             <w:vAlign w:val="center"/>
             <w:tcMar>
               <w:top w:w="40" w:type="dxa"/>
@@ -6149,13 +5860,13 @@
                 <w:b w:val="0"/>
                 <w:sz w:val="24"/>
               </w:rPr>
-              <w:t>Неопределённая граница достаточной истории</w:t>
+              <w:t>Восемь сценариев</w:t>
             </w:r>
           </w:p>
         </w:tc>
         <w:tc>
           <w:tcPr>
-            <w:tcW w:type="dxa" w:w="3855"/>
+            <w:tcW w:type="dxa" w:w="6066"/>
             <w:vAlign w:val="center"/>
             <w:tcMar>
               <w:top w:w="40" w:type="dxa"/>
@@ -6176,7 +5887,7 @@
                 <w:b w:val="0"/>
                 <w:sz w:val="24"/>
               </w:rPr>
-              <w:t>Принято; уточнён REQ-FUNC-016</w:t>
+              <w:t>Связаны со всеми 18 функциональными требованиями</w:t>
             </w:r>
           </w:p>
         </w:tc>
@@ -6187,7 +5898,7 @@
         </w:trPr>
         <w:tc>
           <w:tcPr>
-            <w:tcW w:type="dxa" w:w="850"/>
+            <w:tcW w:type="dxa" w:w="3288"/>
             <w:vAlign w:val="center"/>
             <w:tcMar>
               <w:top w:w="40" w:type="dxa"/>
@@ -6208,13 +5919,13 @@
                 <w:b w:val="0"/>
                 <w:sz w:val="24"/>
               </w:rPr>
-              <w:t>R-03</w:t>
+              <w:t>Загрузка SysML v2 Pilot</w:t>
             </w:r>
           </w:p>
         </w:tc>
         <w:tc>
           <w:tcPr>
-            <w:tcW w:type="dxa" w:w="4649"/>
+            <w:tcW w:type="dxa" w:w="6066"/>
             <w:vAlign w:val="center"/>
             <w:tcMar>
               <w:top w:w="40" w:type="dxa"/>
@@ -6235,13 +5946,18 @@
                 <w:b w:val="0"/>
                 <w:sz w:val="24"/>
               </w:rPr>
-              <w:t>Просроченный платёж может исчезнуть из прогноза</w:t>
+              <w:t>Все исходники загружены без ошибок</w:t>
             </w:r>
           </w:p>
         </w:tc>
+      </w:tr>
+      <w:tr>
+        <w:trPr>
+          <w:cantSplit/>
+        </w:trPr>
         <w:tc>
           <w:tcPr>
-            <w:tcW w:type="dxa" w:w="3855"/>
+            <w:tcW w:type="dxa" w:w="3288"/>
             <w:vAlign w:val="center"/>
             <w:tcMar>
               <w:top w:w="40" w:type="dxa"/>
@@ -6262,18 +5978,13 @@
                 <w:b w:val="0"/>
                 <w:sz w:val="24"/>
               </w:rPr>
-              <w:t>Принято; добавлен REQ-FUNC-018</w:t>
+              <w:t>Экспорт графики</w:t>
             </w:r>
           </w:p>
         </w:tc>
-      </w:tr>
-      <w:tr>
-        <w:trPr>
-          <w:cantSplit/>
-        </w:trPr>
         <w:tc>
           <w:tcPr>
-            <w:tcW w:type="dxa" w:w="850"/>
+            <w:tcW w:type="dxa" w:w="6066"/>
             <w:vAlign w:val="center"/>
             <w:tcMar>
               <w:top w:w="40" w:type="dxa"/>
@@ -6294,13 +6005,18 @@
                 <w:b w:val="0"/>
                 <w:sz w:val="24"/>
               </w:rPr>
-              <w:t>R-04</w:t>
+              <w:t>Получены восемь PNG</w:t>
             </w:r>
           </w:p>
         </w:tc>
+      </w:tr>
+      <w:tr>
+        <w:trPr>
+          <w:cantSplit/>
+        </w:trPr>
         <w:tc>
           <w:tcPr>
-            <w:tcW w:type="dxa" w:w="4649"/>
+            <w:tcW w:type="dxa" w:w="3288"/>
             <w:vAlign w:val="center"/>
             <w:tcMar>
               <w:top w:w="40" w:type="dxa"/>
@@ -6321,13 +6037,13 @@
                 <w:b w:val="0"/>
                 <w:sz w:val="24"/>
               </w:rPr>
-              <w:t>Автоматическая загрузка операций из банков</w:t>
+              <w:t>Формулы и календарь</w:t>
             </w:r>
           </w:p>
         </w:tc>
         <w:tc>
           <w:tcPr>
-            <w:tcW w:type="dxa" w:w="3855"/>
+            <w:tcW w:type="dxa" w:w="6066"/>
             <w:vAlign w:val="center"/>
             <w:tcMar>
               <w:top w:w="40" w:type="dxa"/>
@@ -6348,7 +6064,7 @@
                 <w:b w:val="0"/>
                 <w:sz w:val="24"/>
               </w:rPr>
-              <w:t>Отложено; противоречит границам версии</w:t>
+              <w:t>16 автоматических проверок пройдены</w:t>
             </w:r>
           </w:p>
         </w:tc>
@@ -6359,7 +6075,7 @@
         </w:trPr>
         <w:tc>
           <w:tcPr>
-            <w:tcW w:type="dxa" w:w="850"/>
+            <w:tcW w:type="dxa" w:w="3288"/>
             <w:vAlign w:val="center"/>
             <w:tcMar>
               <w:top w:w="40" w:type="dxa"/>
@@ -6380,13 +6096,13 @@
                 <w:b w:val="0"/>
                 <w:sz w:val="24"/>
               </w:rPr>
-              <w:t>R-05</w:t>
+              <w:t>Ссылки</w:t>
             </w:r>
           </w:p>
         </w:tc>
         <w:tc>
           <w:tcPr>
-            <w:tcW w:type="dxa" w:w="4649"/>
+            <w:tcW w:type="dxa" w:w="6066"/>
             <w:vAlign w:val="center"/>
             <w:tcMar>
               <w:top w:w="40" w:type="dxa"/>
@@ -6407,34 +6123,7 @@
                 <w:b w:val="0"/>
                 <w:sz w:val="24"/>
               </w:rPr>
-              <w:t>Применение нейросети</w:t>
-            </w:r>
-          </w:p>
-        </w:tc>
-        <w:tc>
-          <w:tcPr>
-            <w:tcW w:type="dxa" w:w="3855"/>
-            <w:vAlign w:val="center"/>
-            <w:tcMar>
-              <w:top w:w="40" w:type="dxa"/>
-              <w:left w:w="70" w:type="dxa"/>
-              <w:bottom w:w="40" w:type="dxa"/>
-              <w:right w:w="70" w:type="dxa"/>
-            </w:tcMar>
-          </w:tcPr>
-          <w:p>
-            <w:pPr>
-              <w:spacing w:after="40" w:before="40" w:line="240" w:lineRule="auto"/>
-              <w:ind w:firstLine="0"/>
-              <w:jc w:val="left"/>
-            </w:pPr>
-            <w:r>
-              <w:rPr>
-                <w:rFonts w:ascii="Times New Roman" w:hAnsi="Times New Roman"/>
-                <w:b w:val="0"/>
-                <w:sz w:val="24"/>
-              </w:rPr>
-              <w:t>Отклонено для версии 1.0; согласованы прозрачные формулы</w:t>
+              <w:t>Локальные файлы и оглавление проверены</w:t>
             </w:r>
           </w:p>
         </w:tc>
@@ -6470,7 +6159,7 @@
           <w:color w:val="000000"/>
           <w:sz w:val="28"/>
         </w:rPr>
-        <w:t>Изменения отражены в версии SRS 0.2, модели и сценариях. Реальные отзывы будут добавлены с указанием автора, даты, решения и затронутых требований. До их получения внешнее согласование остаётся открытым.</w:t>
+        <w:t>Испытания производительности, безопасности, конкурентного подтверждения платежей и восстановления хранилища запланированы для реализации. Успешное построение модели не заменяет эти испытания.</w:t>
       </w:r>
     </w:p>
     <w:p>
@@ -6506,7 +6195,7 @@
           <w:color w:val="000000"/>
           <w:sz w:val="28"/>
         </w:rPr>
-        <w:t>Подготовлен комплект требований для проекта «Баланс»: определены пользователь, границы продукта, бизнес-цели и правила учёта. Результаты позволяют перейти к обсуждению с заказчиком и последующему проектированию.</w:t>
+        <w:t>Подготовлен комплект требований для проекта «Баланс»: определены пользователь, границы продукта, бизнес-цели и правила учёта. Результаты позволяют перейти к последующему проектированию.</w:t>
       </w:r>
     </w:p>
     <w:p>
@@ -6632,7 +6321,7 @@
                 <w:b w:val="0"/>
                 <w:sz w:val="24"/>
               </w:rPr>
-              <w:t>SRS 0.2</w:t>
+              <w:t>SRS 0.3</w:t>
             </w:r>
           </w:p>
         </w:tc>
@@ -6718,7 +6407,7 @@
                 <w:b w:val="0"/>
                 <w:sz w:val="24"/>
               </w:rPr>
-              <w:t>Требования, 37 связей satisfy, шесть сценариев, экраны и данные</w:t>
+              <w:t>Требования, 37 связей satisfy, восемь сценариев и шесть экранов</w:t>
             </w:r>
           </w:p>
         </w:tc>
@@ -6777,7 +6466,7 @@
                 <w:b w:val="0"/>
                 <w:sz w:val="24"/>
               </w:rPr>
-              <w:t>Пять представлений модели; пять основных макетов; три состояния интерфейса</w:t>
+              <w:t>Восемь PNG: контекст, варианты использования и шесть экранов</w:t>
             </w:r>
           </w:p>
         </w:tc>
@@ -6868,7 +6557,7 @@
                 <w:b w:val="0"/>
                 <w:sz w:val="24"/>
               </w:rPr>
-              <w:t>Работа с требованиями</w:t>
+              <w:t>Приложения SRS</w:t>
             </w:r>
           </w:p>
         </w:tc>
@@ -6895,7 +6584,7 @@
                 <w:b w:val="0"/>
                 <w:sz w:val="24"/>
               </w:rPr>
-              <w:t>Предварительные интервью и рецензия; три принятых уточнения</w:t>
+              <w:t>Графика, словарь данных, расчёты, трассировка целей и технические вопросы</w:t>
             </w:r>
           </w:p>
         </w:tc>
@@ -6990,7 +6679,7 @@
           <w:color w:val="000000"/>
           <w:sz w:val="28"/>
         </w:rPr>
-        <w:t>Автоматическая проверка подтвердила уникальность ID, совпадение формулировок между SRS и моделью, наличие строк матрицы и сценариев, корректность локальных ссылок. Парсер успешно разобрал синтаксис всей модели.</w:t>
+        <w:t>Автоматическая проверка подтвердила уникальность ID, совпадение формулировок между SRS и моделью, наличие строк матрицы и сценариев, корректность локальных ссылок. SysML v2 Pilot загрузил модели и построил все графические представления.</w:t>
       </w:r>
     </w:p>
     <w:p>
@@ -7024,7 +6713,7 @@
           <w:color w:val="000000"/>
           <w:sz w:val="28"/>
         </w:rPr>
-        <w:t>Материалы подготовлены для демонстрации преподавателю. Открытые действия: подтверждение интервью Новицким Е. Ю., его отзыв в PR и внесение замечаний преподавателя. Работающее приложение и его испытания в результаты этой лабораторной не включены.</w:t>
+        <w:t>Материалы подготовлены для демонстрации преподавателю и рассмотрения в pull request. Работающее приложение и его испытания в результаты этой лабораторной не включены.</w:t>
       </w:r>
     </w:p>
     <w:p>
@@ -7301,7 +6990,7 @@
           <w:color w:val="000000"/>
           <w:sz w:val="28"/>
         </w:rPr>
-        <w:t>Спецификация версии 0.2 содержит 37 требований с критериями приёмки и методами проверки. Разработаны текстовая модель SysML v2, её графические представления и макеты пользовательского интерфейса. Согласованность идентификаторов, ссылок и расчётных примеров проверена автоматически.</w:t>
+        <w:t>Спецификация версии 0.3 содержит 37 требований с критериями приёмки и методами проверки. Разработаны текстовая модель SysML v2, её графические представления и макеты пользовательского интерфейса. Согласованность идентификаторов, ссылок и расчётных примеров проверена автоматически.</w:t>
       </w:r>
     </w:p>
     <w:p>
@@ -7318,7 +7007,7 @@
           <w:color w:val="000000"/>
           <w:sz w:val="28"/>
         </w:rPr>
-        <w:t>Предварительное рецензирование позволило уточнить защиту от двойного учёта платежа, границу достаточной истории и поведение просроченных вхождений. Эти изменения сохранены вместе с историей требований. Материалы опубликованы в отдельной ветке и оформлены в pull request.</w:t>
+        <w:t>Правила исключают двойной учёт регулярного платежа, задают границу достаточной истории и поведение просроченных вхождений. Графические модели показывают эти правила через поля, действия и сообщения будущего интерфейса. Все материалы опубликованы в отдельной ветке и оформлены в pull request.</w:t>
       </w:r>
     </w:p>
     <w:p>
@@ -7335,7 +7024,7 @@
           <w:color w:val="000000"/>
           <w:sz w:val="28"/>
         </w:rPr>
-        <w:t>Следующий этап — подтверждение подготовленных материалов напарником и преподавателем, затем проектирование архитектуры и реализация приложения. Полученные требования задают основу для этих работ и для последующей приёмки.</w:t>
+        <w:t>Следующий этап — проектирование архитектуры и реализация приложения. Требования, словарь данных и сценарии верификации задают основу для этих работ и последующей приёмки.</w:t>
       </w:r>
     </w:p>
     <w:p>
@@ -7444,6 +7133,23 @@
     </w:p>
     <w:p>
       <w:pPr>
+        <w:keepNext w:val="0"/>
+        <w:spacing w:after="240" w:before="0" w:line="360" w:lineRule="exact"/>
+        <w:ind w:firstLine="709" w:left="0" w:right="0"/>
+        <w:jc w:val="both"/>
+      </w:pPr>
+      <w:r>
+        <w:rPr>
+          <w:rFonts w:ascii="Times New Roman" w:hAnsi="Times New Roman"/>
+          <w:b w:val="0"/>
+          <w:color w:val="000000"/>
+          <w:sz w:val="28"/>
+        </w:rPr>
+        <w:t>[6] Бутор К. П. ЛР3: SRS «Охотник за скидками в Steam». Образец структуры SRS и экспорта SysML v2: https://github.com/kiryshabutor/SDLC/pull/1. Дата обращения: 25.10.2026.</w:t>
+      </w:r>
+    </w:p>
+    <w:p>
+      <w:pPr>
         <w:keepNext/>
         <w:pageBreakBefore/>
         <w:spacing w:after="360" w:before="0" w:line="360" w:lineRule="exact"/>
@@ -7883,7 +7589,7 @@
           <w:color w:val="000000"/>
           <w:sz w:val="28"/>
         </w:rPr>
-        <w:t>В полной модели требование связано со сценарием Forecast. Экран прогноза ссылается на HTML-макет через атрибут mockup. Графические представления используют те же идентификаторы.</w:t>
+        <w:t>В файле use-cases.sysml требование связано со сценарием получения прогнозов через dependency. Экран прогноза описан в ui-06-forecast.sysml элементами библиотеки UiKit. Изображение экрана строится из этой модели.</w:t>
       </w:r>
     </w:p>
     <w:p>
@@ -7953,7 +7659,7 @@
           <w:color w:val="000000"/>
           <w:sz w:val="20"/>
         </w:rPr>
-        <w:t>srs/srs.md                 Спецификация 0.2</w:t>
+        <w:t>srs/srs.md                 Спецификация 0.3</w:t>
       </w:r>
     </w:p>
     <w:p>
@@ -7987,7 +7693,7 @@
           <w:color w:val="000000"/>
           <w:sz w:val="20"/>
         </w:rPr>
-        <w:t>srs/sysml/                 Модель и SVG</w:t>
+        <w:t>srs/sysml/                 Исходные модели SysML v2</w:t>
       </w:r>
     </w:p>
     <w:p>
@@ -8004,7 +7710,7 @@
           <w:color w:val="000000"/>
           <w:sz w:val="20"/>
         </w:rPr>
-        <w:t>srs/img/                   Диаграммы и макеты PNG</w:t>
+        <w:t>srs/images/                Диаграммы и макеты PNG</w:t>
       </w:r>
     </w:p>
     <w:p>
@@ -8021,7 +7727,7 @@
           <w:color w:val="000000"/>
           <w:sz w:val="20"/>
         </w:rPr>
-        <w:t>srs/mockups/               HTML и CSS прототипов</w:t>
+        <w:t>srs/sysml/tools/           Docker и экспорт моделей</w:t>
       </w:r>
     </w:p>
     <w:p>
@@ -8038,7 +7744,7 @@
           <w:color w:val="000000"/>
           <w:sz w:val="20"/>
         </w:rPr>
-        <w:t>srs/review/                Интервью и рецензия</w:t>
+        <w:t>srs/verification/          Сценарии и проверки</w:t>
       </w:r>
     </w:p>
     <w:p>
@@ -8055,7 +7761,7 @@
           <w:color w:val="000000"/>
           <w:sz w:val="20"/>
         </w:rPr>
-        <w:t>srs/verification/          Сценарии и проверки</w:t>
+        <w:t>tools/                     Средства воспроизведения</w:t>
       </w:r>
     </w:p>
     <w:p>
@@ -8072,7 +7778,24 @@
           <w:color w:val="000000"/>
           <w:sz w:val="20"/>
         </w:rPr>
-        <w:t>tools/                     Средства воспроизведения</w:t>
+        <w:t>reports/lab3/              Итоговый отчёт</w:t>
+      </w:r>
+    </w:p>
+    <w:p>
+      <w:pPr>
+        <w:keepNext w:val="0"/>
+        <w:spacing w:after="0" w:before="360" w:line="360" w:lineRule="exact"/>
+        <w:ind w:firstLine="709" w:left="0" w:right="0"/>
+        <w:jc w:val="both"/>
+      </w:pPr>
+      <w:r>
+        <w:rPr>
+          <w:rFonts w:ascii="Times New Roman" w:hAnsi="Times New Roman"/>
+          <w:b w:val="0"/>
+          <w:color w:val="000000"/>
+          <w:sz w:val="28"/>
+        </w:rPr>
+        <w:t>Основные действия при подготовке ветки и публикации:</w:t>
       </w:r>
     </w:p>
     <w:p>
@@ -8089,7 +7812,109 @@
           <w:color w:val="000000"/>
           <w:sz w:val="20"/>
         </w:rPr>
-        <w:t>reports/lab3/              Итоговый отчёт</w:t>
+        <w:t>git fetch origin</w:t>
+      </w:r>
+    </w:p>
+    <w:p>
+      <w:pPr>
+        <w:keepNext w:val="0"/>
+        <w:spacing w:after="0" w:before="0" w:line="280" w:lineRule="exact"/>
+        <w:ind w:firstLine="0" w:left="0" w:right="0"/>
+        <w:jc w:val="left"/>
+      </w:pPr>
+      <w:r>
+        <w:rPr>
+          <w:rFonts w:ascii="Courier New" w:hAnsi="Courier New"/>
+          <w:b w:val="0"/>
+          <w:color w:val="000000"/>
+          <w:sz w:val="20"/>
+        </w:rPr>
+        <w:t>git switch -c feature/lab3-balance-srs origin/main</w:t>
+      </w:r>
+    </w:p>
+    <w:p>
+      <w:pPr>
+        <w:keepNext w:val="0"/>
+        <w:spacing w:after="0" w:before="0" w:line="280" w:lineRule="exact"/>
+        <w:ind w:firstLine="0" w:left="0" w:right="0"/>
+        <w:jc w:val="left"/>
+      </w:pPr>
+      <w:r>
+        <w:rPr>
+          <w:rFonts w:ascii="Courier New" w:hAnsi="Courier New"/>
+          <w:b w:val="0"/>
+          <w:color w:val="000000"/>
+          <w:sz w:val="20"/>
+        </w:rPr>
+        <w:t>git add srs/ tools/ reports/ README.md</w:t>
+      </w:r>
+    </w:p>
+    <w:p>
+      <w:pPr>
+        <w:keepNext w:val="0"/>
+        <w:spacing w:after="0" w:before="0" w:line="280" w:lineRule="exact"/>
+        <w:ind w:firstLine="0" w:left="0" w:right="0"/>
+        <w:jc w:val="left"/>
+      </w:pPr>
+      <w:r>
+        <w:rPr>
+          <w:rFonts w:ascii="Courier New" w:hAnsi="Courier New"/>
+          <w:b w:val="0"/>
+          <w:color w:val="000000"/>
+          <w:sz w:val="20"/>
+        </w:rPr>
+        <w:t>git commit -m "docs(lab3): Balance requirements"</w:t>
+      </w:r>
+    </w:p>
+    <w:p>
+      <w:pPr>
+        <w:keepNext w:val="0"/>
+        <w:spacing w:after="0" w:before="0" w:line="280" w:lineRule="exact"/>
+        <w:ind w:firstLine="0" w:left="0" w:right="0"/>
+        <w:jc w:val="left"/>
+      </w:pPr>
+      <w:r>
+        <w:rPr>
+          <w:rFonts w:ascii="Courier New" w:hAnsi="Courier New"/>
+          <w:b w:val="0"/>
+          <w:color w:val="000000"/>
+          <w:sz w:val="20"/>
+        </w:rPr>
+        <w:t>git push -u origin feature/lab3-balance-srs</w:t>
+      </w:r>
+    </w:p>
+    <w:p>
+      <w:pPr>
+        <w:keepNext w:val="0"/>
+        <w:spacing w:after="0" w:before="0" w:line="280" w:lineRule="exact"/>
+        <w:ind w:firstLine="0" w:left="0" w:right="0"/>
+        <w:jc w:val="left"/>
+      </w:pPr>
+      <w:r>
+        <w:rPr>
+          <w:rFonts w:ascii="Courier New" w:hAnsi="Courier New"/>
+          <w:b w:val="0"/>
+          <w:color w:val="000000"/>
+          <w:sz w:val="20"/>
+        </w:rPr>
+        <w:t>gh pr create --repo ekuzm/SDLC --base main \</w:t>
+      </w:r>
+    </w:p>
+    <w:p>
+      <w:pPr>
+        <w:keepNext w:val="0"/>
+        <w:spacing w:after="0" w:before="0" w:line="280" w:lineRule="exact"/>
+        <w:ind w:firstLine="0" w:left="0" w:right="0"/>
+        <w:jc w:val="left"/>
+      </w:pPr>
+      <w:r>
+        <w:rPr>
+          <w:rFonts w:ascii="Courier New" w:hAnsi="Courier New"/>
+          <w:b w:val="0"/>
+          <w:color w:val="000000"/>
+          <w:sz w:val="20"/>
+        </w:rPr>
+        <w:t xml:space="preserve">  --head feature/lab3-balance-srs --body-file pr.md</w:t>
       </w:r>
     </w:p>
     <w:p>
@@ -8106,132 +7931,30 @@
           <w:color w:val="000000"/>
           <w:sz w:val="28"/>
         </w:rPr>
-        <w:t>Основные действия при подготовке ветки и публикации:</w:t>
+        <w:t>Ссылка на запрос рецензирования:</w:t>
       </w:r>
     </w:p>
     <w:p>
       <w:pPr>
         <w:keepNext w:val="0"/>
-        <w:spacing w:after="0" w:before="0" w:line="280" w:lineRule="exact"/>
+        <w:spacing w:after="0" w:before="0" w:line="276" w:lineRule="exact"/>
         <w:ind w:firstLine="0" w:left="0" w:right="0"/>
-        <w:jc w:val="left"/>
-      </w:pPr>
-      <w:r>
-        <w:rPr>
-          <w:rFonts w:ascii="Courier New" w:hAnsi="Courier New"/>
+        <w:jc w:val="both"/>
+      </w:pPr>
+      <w:r>
+        <w:rPr>
+          <w:rFonts w:ascii="Times New Roman" w:hAnsi="Times New Roman"/>
           <w:b w:val="0"/>
           <w:color w:val="000000"/>
-          <w:sz w:val="20"/>
-        </w:rPr>
-        <w:t>git fetch origin</w:t>
+          <w:sz w:val="24"/>
+        </w:rPr>
+        <w:t>https://github.com/ekuzm/SDLC/pull/1</w:t>
       </w:r>
     </w:p>
     <w:p>
       <w:pPr>
         <w:keepNext w:val="0"/>
-        <w:spacing w:after="0" w:before="0" w:line="280" w:lineRule="exact"/>
-        <w:ind w:firstLine="0" w:left="0" w:right="0"/>
-        <w:jc w:val="left"/>
-      </w:pPr>
-      <w:r>
-        <w:rPr>
-          <w:rFonts w:ascii="Courier New" w:hAnsi="Courier New"/>
-          <w:b w:val="0"/>
-          <w:color w:val="000000"/>
-          <w:sz w:val="20"/>
-        </w:rPr>
-        <w:t>git switch -c feature/lab3-balance-srs origin/main</w:t>
-      </w:r>
-    </w:p>
-    <w:p>
-      <w:pPr>
-        <w:keepNext w:val="0"/>
-        <w:spacing w:after="0" w:before="0" w:line="280" w:lineRule="exact"/>
-        <w:ind w:firstLine="0" w:left="0" w:right="0"/>
-        <w:jc w:val="left"/>
-      </w:pPr>
-      <w:r>
-        <w:rPr>
-          <w:rFonts w:ascii="Courier New" w:hAnsi="Courier New"/>
-          <w:b w:val="0"/>
-          <w:color w:val="000000"/>
-          <w:sz w:val="20"/>
-        </w:rPr>
-        <w:t>git add srs/ tools/ reports/ README.md</w:t>
-      </w:r>
-    </w:p>
-    <w:p>
-      <w:pPr>
-        <w:keepNext w:val="0"/>
-        <w:spacing w:after="0" w:before="0" w:line="280" w:lineRule="exact"/>
-        <w:ind w:firstLine="0" w:left="0" w:right="0"/>
-        <w:jc w:val="left"/>
-      </w:pPr>
-      <w:r>
-        <w:rPr>
-          <w:rFonts w:ascii="Courier New" w:hAnsi="Courier New"/>
-          <w:b w:val="0"/>
-          <w:color w:val="000000"/>
-          <w:sz w:val="20"/>
-        </w:rPr>
-        <w:t>git commit -m "docs(lab3): Balance requirements"</w:t>
-      </w:r>
-    </w:p>
-    <w:p>
-      <w:pPr>
-        <w:keepNext w:val="0"/>
-        <w:spacing w:after="0" w:before="0" w:line="280" w:lineRule="exact"/>
-        <w:ind w:firstLine="0" w:left="0" w:right="0"/>
-        <w:jc w:val="left"/>
-      </w:pPr>
-      <w:r>
-        <w:rPr>
-          <w:rFonts w:ascii="Courier New" w:hAnsi="Courier New"/>
-          <w:b w:val="0"/>
-          <w:color w:val="000000"/>
-          <w:sz w:val="20"/>
-        </w:rPr>
-        <w:t>git push -u origin feature/lab3-balance-srs</w:t>
-      </w:r>
-    </w:p>
-    <w:p>
-      <w:pPr>
-        <w:keepNext w:val="0"/>
-        <w:spacing w:after="0" w:before="0" w:line="280" w:lineRule="exact"/>
-        <w:ind w:firstLine="0" w:left="0" w:right="0"/>
-        <w:jc w:val="left"/>
-      </w:pPr>
-      <w:r>
-        <w:rPr>
-          <w:rFonts w:ascii="Courier New" w:hAnsi="Courier New"/>
-          <w:b w:val="0"/>
-          <w:color w:val="000000"/>
-          <w:sz w:val="20"/>
-        </w:rPr>
-        <w:t>gh pr create --repo ekuzm/SDLC --base main \</w:t>
-      </w:r>
-    </w:p>
-    <w:p>
-      <w:pPr>
-        <w:keepNext w:val="0"/>
-        <w:spacing w:after="0" w:before="0" w:line="280" w:lineRule="exact"/>
-        <w:ind w:firstLine="0" w:left="0" w:right="0"/>
-        <w:jc w:val="left"/>
-      </w:pPr>
-      <w:r>
-        <w:rPr>
-          <w:rFonts w:ascii="Courier New" w:hAnsi="Courier New"/>
-          <w:b w:val="0"/>
-          <w:color w:val="000000"/>
-          <w:sz w:val="20"/>
-        </w:rPr>
-        <w:t xml:space="preserve">  --head feature/lab3-balance-srs --body-file pr.md</w:t>
-      </w:r>
-    </w:p>
-    <w:p>
-      <w:pPr>
-        <w:keepNext w:val="0"/>
-        <w:spacing w:after="0" w:before="360" w:line="360" w:lineRule="exact"/>
+        <w:spacing w:after="0" w:before="240" w:line="360" w:lineRule="exact"/>
         <w:ind w:firstLine="709" w:left="0" w:right="0"/>
         <w:jc w:val="both"/>
       </w:pPr>
@@ -8242,41 +7965,7 @@
           <w:color w:val="000000"/>
           <w:sz w:val="28"/>
         </w:rPr>
-        <w:t>Ссылка на запрос рецензирования:</w:t>
-      </w:r>
-    </w:p>
-    <w:p>
-      <w:pPr>
-        <w:keepNext w:val="0"/>
-        <w:spacing w:after="0" w:before="0" w:line="276" w:lineRule="exact"/>
-        <w:ind w:firstLine="0" w:left="0" w:right="0"/>
-        <w:jc w:val="both"/>
-      </w:pPr>
-      <w:r>
-        <w:rPr>
-          <w:rFonts w:ascii="Times New Roman" w:hAnsi="Times New Roman"/>
-          <w:b w:val="0"/>
-          <w:color w:val="000000"/>
-          <w:sz w:val="24"/>
-        </w:rPr>
-        <w:t>https://github.com/ekuzm/SDLC/pull/1</w:t>
-      </w:r>
-    </w:p>
-    <w:p>
-      <w:pPr>
-        <w:keepNext w:val="0"/>
-        <w:spacing w:after="0" w:before="240" w:line="360" w:lineRule="exact"/>
-        <w:ind w:firstLine="709" w:left="0" w:right="0"/>
-        <w:jc w:val="both"/>
-      </w:pPr>
-      <w:r>
-        <w:rPr>
-          <w:rFonts w:ascii="Times New Roman" w:hAnsi="Times New Roman"/>
-          <w:b w:val="0"/>
-          <w:color w:val="000000"/>
-          <w:sz w:val="28"/>
-        </w:rPr>
-        <w:t>После ответа напарника в ту же ветку добавляются изменения спецификации и запись решения по каждому замечанию. Слияние выполняется после завершения рецензирования.</w:t>
+        <w:t>Графика воспроизводится командой sh srs/sysml/tools/render-all.sh. Документы и расчётные примеры проверяются командой python3 tools/check_artifacts.py. Изменения требований фиксируются отдельными коммитами в этой же ветке.</w:t>
       </w:r>
     </w:p>
     <w:sectPr>

</xml_diff>